<commit_message>
Fix motion_suppress parent question missing from output document (#25)
</commit_message>
<xml_diff>
--- a/docassemble/CriminalDocketingStatement/data/templates/criminal_docketing_statement.docx
+++ b/docassemble/CriminalDocketingStatement/data/templates/criminal_docketing_statement.docx
@@ -1,6 +1,6 @@
 
 <file path=word/document.xml><?xml version="1.0" encoding="utf-8"?>
-<w:document xmlns:wpc="http://schemas.microsoft.com/office/word/2010/wordprocessingCanvas" xmlns:cx="http://schemas.microsoft.com/office/drawing/2014/chartex" xmlns:cx1="http://schemas.microsoft.com/office/drawing/2015/9/8/chartex" xmlns:cx2="http://schemas.microsoft.com/office/drawing/2015/10/21/chartex" xmlns:cx3="http://schemas.microsoft.com/office/drawing/2016/5/9/chartex" xmlns:cx4="http://schemas.microsoft.com/office/drawing/2016/5/10/chartex" xmlns:cx5="http://schemas.microsoft.com/office/drawing/2016/5/11/chartex" xmlns:cx6="http://schemas.microsoft.com/office/drawing/2016/5/12/chartex" xmlns:cx7="http://schemas.microsoft.com/office/drawing/2016/5/13/chartex" xmlns:cx8="http://schemas.microsoft.com/office/drawing/2016/5/14/chartex" xmlns:mc="http://schemas.openxmlformats.org/markup-compatibility/2006" xmlns:aink="http://schemas.microsoft.com/office/drawing/2016/ink" xmlns:am3d="http://schemas.microsoft.com/office/drawing/2017/model3d" xmlns:o="urn:schemas-microsoft-com:office:office" xmlns:oel="http://schemas.microsoft.com/office/2019/extlst" xmlns:r="http://schemas.openxmlformats.org/officeDocument/2006/relationships" xmlns:m="http://schemas.openxmlformats.org/officeDocument/2006/math" xmlns:v="urn:schemas-microsoft-com:vml" xmlns:wp14="http://schemas.microsoft.com/office/word/2010/wordprocessingDrawing" xmlns:wp="http://schemas.openxmlformats.org/drawingml/2006/wordprocessingDrawing" xmlns:w10="urn:schemas-microsoft-com:office:word" xmlns:w="http://schemas.openxmlformats.org/wordprocessingml/2006/main" xmlns:w14="http://schemas.microsoft.com/office/word/2010/wordml" xmlns:w15="http://schemas.microsoft.com/office/word/2012/wordml" xmlns:w16cex="http://schemas.microsoft.com/office/word/2018/wordml/cex" xmlns:w16cid="http://schemas.microsoft.com/office/word/2016/wordml/cid" xmlns:w16="http://schemas.microsoft.com/office/word/2018/wordml" xmlns:w16du="http://schemas.microsoft.com/office/word/2023/wordml/word16du" xmlns:w16sdtdh="http://schemas.microsoft.com/office/word/2020/wordml/sdtdatahash" xmlns:w16se="http://schemas.microsoft.com/office/word/2015/wordml/symex" xmlns:wpg="http://schemas.microsoft.com/office/word/2010/wordprocessingGroup" xmlns:wpi="http://schemas.microsoft.com/office/word/2010/wordprocessingInk" xmlns:wne="http://schemas.microsoft.com/office/word/2006/wordml" xmlns:wps="http://schemas.microsoft.com/office/word/2010/wordprocessingShape" mc:Ignorable="w14 w15 w16se w16cid w16 w16cex w16sdtdh w16du wp14">
+<w:document xmlns:wpc="http://schemas.microsoft.com/office/word/2010/wordprocessingCanvas" xmlns:cx="http://schemas.microsoft.com/office/drawing/2014/chartex" xmlns:cx1="http://schemas.microsoft.com/office/drawing/2015/9/8/chartex" xmlns:cx2="http://schemas.microsoft.com/office/drawing/2015/10/21/chartex" xmlns:cx3="http://schemas.microsoft.com/office/drawing/2016/5/9/chartex" xmlns:cx4="http://schemas.microsoft.com/office/drawing/2016/5/10/chartex" xmlns:cx5="http://schemas.microsoft.com/office/drawing/2016/5/11/chartex" xmlns:cx6="http://schemas.microsoft.com/office/drawing/2016/5/12/chartex" xmlns:cx7="http://schemas.microsoft.com/office/drawing/2016/5/13/chartex" xmlns:cx8="http://schemas.microsoft.com/office/drawing/2016/5/14/chartex" xmlns:mc="http://schemas.openxmlformats.org/markup-compatibility/2006" xmlns:m="http://schemas.openxmlformats.org/officeDocument/2006/math" xmlns:aink="http://schemas.microsoft.com/office/drawing/2016/ink" xmlns:am3d="http://schemas.microsoft.com/office/drawing/2017/model3d" xmlns:oel="http://schemas.microsoft.com/office/2019/extlst" xmlns:r="http://schemas.openxmlformats.org/officeDocument/2006/relationships" xmlns:wp14="http://schemas.microsoft.com/office/word/2010/wordprocessingDrawing" xmlns:wp="http://schemas.openxmlformats.org/drawingml/2006/wordprocessingDrawing" xmlns:wpg="http://schemas.microsoft.com/office/word/2010/wordprocessingGroup" xmlns:wpi="http://schemas.microsoft.com/office/word/2010/wordprocessingInk" xmlns:wps="http://schemas.microsoft.com/office/word/2010/wordprocessingShape" xmlns:o="urn:schemas-microsoft-com:office:office" xmlns:v="urn:schemas-microsoft-com:vml" xmlns:w10="urn:schemas-microsoft-com:office:word" xmlns:w="http://schemas.openxmlformats.org/wordprocessingml/2006/main" xmlns:w14="http://schemas.microsoft.com/office/word/2010/wordml" xmlns:w15="http://schemas.microsoft.com/office/word/2012/wordml" xmlns:w16cex="http://schemas.microsoft.com/office/word/2018/wordml/cex" xmlns:w16cid="http://schemas.microsoft.com/office/word/2016/wordml/cid" xmlns:w16="http://schemas.microsoft.com/office/word/2018/wordml" xmlns:w16sdtdh="http://schemas.microsoft.com/office/word/2020/wordml/sdtdatahash" xmlns:w16sdtfl="http://schemas.microsoft.com/office/word/2024/wordml/sdtformatlock" xmlns:w16se="http://schemas.microsoft.com/office/word/2015/wordml/symex" xmlns:w16du="http://schemas.microsoft.com/office/word/2023/wordml/word16du" xmlns:wne="http://schemas.microsoft.com/office/word/2006/wordml" mc:Ignorable="w14 w15 w16se w16cid w16 w16cex w16sdtdh w16sdtfl w16du wp14">
   <w:body>
     <w:p>
       <w:pPr>
@@ -1693,7 +1693,15 @@
           <w:spacing w:val="-2"/>
           <w:sz w:val="20"/>
         </w:rPr>
-        <w:t xml:space="preserve"> {{ </w:t>
+        <w:t xml:space="preserve"> </w:t>
+      </w:r>
+      <w:proofErr w:type="gramStart"/>
+      <w:r>
+        <w:rPr>
+          <w:spacing w:val="-2"/>
+          <w:sz w:val="20"/>
+        </w:rPr>
+        <w:t xml:space="preserve">{{ </w:t>
       </w:r>
       <w:proofErr w:type="spellStart"/>
       <w:r>
@@ -1701,7 +1709,23 @@
           <w:spacing w:val="-2"/>
           <w:sz w:val="20"/>
         </w:rPr>
-        <w:t>agency_name</w:t>
+        <w:t>agency</w:t>
+      </w:r>
+      <w:proofErr w:type="gramEnd"/>
+      <w:r>
+        <w:rPr>
+          <w:spacing w:val="-2"/>
+          <w:sz w:val="20"/>
+        </w:rPr>
+        <w:t>_</w:t>
+      </w:r>
+      <w:proofErr w:type="gramStart"/>
+      <w:r>
+        <w:rPr>
+          <w:spacing w:val="-2"/>
+          <w:sz w:val="20"/>
+        </w:rPr>
+        <w:t>name</w:t>
       </w:r>
       <w:proofErr w:type="spellEnd"/>
       <w:r>
@@ -1709,7 +1733,15 @@
           <w:spacing w:val="-2"/>
           <w:sz w:val="20"/>
         </w:rPr>
-        <w:t xml:space="preserve"> }}</w:t>
+        <w:t xml:space="preserve"> }</w:t>
+      </w:r>
+      <w:proofErr w:type="gramEnd"/>
+      <w:r>
+        <w:rPr>
+          <w:spacing w:val="-2"/>
+          <w:sz w:val="20"/>
+        </w:rPr>
+        <w:t>}</w:t>
       </w:r>
     </w:p>
     <w:p>
@@ -4200,7 +4232,23 @@
           <w:sz w:val="20"/>
           <w:szCs w:val="20"/>
         </w:rPr>
-        <w:t>, ".join(</w:t>
+        <w:t xml:space="preserve">, </w:t>
+      </w:r>
+      <w:proofErr w:type="gramStart"/>
+      <w:r>
+        <w:rPr>
+          <w:sz w:val="20"/>
+          <w:szCs w:val="20"/>
+        </w:rPr>
+        <w:t>".join</w:t>
+      </w:r>
+      <w:proofErr w:type="gramEnd"/>
+      <w:r>
+        <w:rPr>
+          <w:sz w:val="20"/>
+          <w:szCs w:val="20"/>
+        </w:rPr>
+        <w:t>(</w:t>
       </w:r>
       <w:proofErr w:type="spellStart"/>
       <w:r>
@@ -4208,14 +4256,31 @@
           <w:sz w:val="20"/>
           <w:szCs w:val="20"/>
         </w:rPr>
-        <w:t>nature_of_appeal</w:t>
-      </w:r>
+        <w:t>nature_of_</w:t>
+      </w:r>
+      <w:proofErr w:type="gramStart"/>
       <w:r>
         <w:rPr>
           <w:sz w:val="20"/>
           <w:szCs w:val="20"/>
         </w:rPr>
-        <w:t>.true_values</w:t>
+        <w:t>appeal.true</w:t>
+      </w:r>
+      <w:proofErr w:type="gramEnd"/>
+      <w:r>
+        <w:rPr>
+          <w:sz w:val="20"/>
+          <w:szCs w:val="20"/>
+        </w:rPr>
+        <w:t>_</w:t>
+      </w:r>
+      <w:proofErr w:type="gramStart"/>
+      <w:r>
+        <w:rPr>
+          <w:sz w:val="20"/>
+          <w:szCs w:val="20"/>
+        </w:rPr>
+        <w:t>values</w:t>
       </w:r>
       <w:proofErr w:type="spellEnd"/>
       <w:r>
@@ -4223,9 +4288,24 @@
           <w:sz w:val="20"/>
           <w:szCs w:val="20"/>
         </w:rPr>
-        <w:t>())</w:t>
-      </w:r>
-      <w:proofErr w:type="spellStart"/>
+        <w:t>(</w:t>
+      </w:r>
+      <w:proofErr w:type="gramEnd"/>
+      <w:r>
+        <w:rPr>
+          <w:sz w:val="20"/>
+          <w:szCs w:val="20"/>
+        </w:rPr>
+        <w:t>)</w:t>
+      </w:r>
+      <w:proofErr w:type="gramStart"/>
+      <w:r>
+        <w:rPr>
+          <w:sz w:val="20"/>
+          <w:szCs w:val="20"/>
+        </w:rPr>
+        <w:t>)</w:t>
+      </w:r>
       <w:r>
         <w:rPr>
           <w:spacing w:val="-2"/>
@@ -4238,7 +4318,15 @@
           <w:spacing w:val="-2"/>
           <w:sz w:val="20"/>
         </w:rPr>
-        <w:t>}}</w:t>
+        <w:t>}</w:t>
+      </w:r>
+      <w:proofErr w:type="gramEnd"/>
+      <w:r>
+        <w:rPr>
+          <w:spacing w:val="-2"/>
+          <w:sz w:val="20"/>
+        </w:rPr>
+        <w:t>}</w:t>
       </w:r>
       <w:r>
         <w:rPr>
@@ -4267,14 +4355,7 @@
         <w:rPr>
           <w:sz w:val="20"/>
         </w:rPr>
-        <w:t>Appeal take</w:t>
-      </w:r>
-      <w:proofErr w:type="spellEnd"/>
-      <w:r>
-        <w:rPr>
-          <w:sz w:val="20"/>
-        </w:rPr>
-        <w:t xml:space="preserve">n from (check all that </w:t>
+        <w:t xml:space="preserve">Appeal taken from (check all that </w:t>
       </w:r>
       <w:r>
         <w:rPr>
@@ -4432,17 +4513,71 @@
         <w:rPr>
           <w:position w:val="1"/>
           <w:sz w:val="20"/>
-        </w:rPr>
-      </w:pPr>
-      <w:r>
-        <w:rPr>
-          <w:sz w:val="20"/>
-        </w:rPr>
-        <w:t>If the appeal involves a motion to suppress, did the judge enter findings?  {{ “Yes” if motion_findings else “No” }}</w:t>
-      </w:r>
-    </w:p>
-    <w:p>
-      <w:pPr>
+          <w:szCs w:val="20"/>
+        </w:rPr>
+      </w:pPr>
+      <w:r>
+        <w:t xml:space="preserve"> </w:t>
+      </w:r>
+      <w:r>
+        <w:rPr>
+          <w:sz w:val="20"/>
+          <w:szCs w:val="20"/>
+        </w:rPr>
+        <w:t xml:space="preserve">Does the appeal involve a motion to suppress? </w:t>
+      </w:r>
+      <w:proofErr w:type="gramStart"/>
+      <w:r>
+        <w:rPr>
+          <w:sz w:val="20"/>
+          <w:szCs w:val="20"/>
+        </w:rPr>
+        <w:t>{{ '</w:t>
+      </w:r>
+      <w:proofErr w:type="gramEnd"/>
+      <w:r>
+        <w:rPr>
+          <w:sz w:val="20"/>
+          <w:szCs w:val="20"/>
+        </w:rPr>
+        <w:t xml:space="preserve">Yes' if </w:t>
+      </w:r>
+      <w:proofErr w:type="spellStart"/>
+      <w:r>
+        <w:rPr>
+          <w:sz w:val="20"/>
+          <w:szCs w:val="20"/>
+        </w:rPr>
+        <w:t>motion_suppress</w:t>
+      </w:r>
+      <w:proofErr w:type="spellEnd"/>
+      <w:r>
+        <w:rPr>
+          <w:sz w:val="20"/>
+          <w:szCs w:val="20"/>
+        </w:rPr>
+        <w:t xml:space="preserve"> else 'No</w:t>
+      </w:r>
+      <w:proofErr w:type="gramStart"/>
+      <w:r>
+        <w:rPr>
+          <w:sz w:val="20"/>
+          <w:szCs w:val="20"/>
+        </w:rPr>
+        <w:t>' }</w:t>
+      </w:r>
+      <w:proofErr w:type="gramEnd"/>
+      <w:r>
+        <w:rPr>
+          <w:sz w:val="20"/>
+          <w:szCs w:val="20"/>
+        </w:rPr>
+        <w:t>}</w:t>
+      </w:r>
+    </w:p>
+    <w:p>
+      <w:pPr>
+        <w:pStyle w:val="ListParagraph"/>
         <w:tabs>
           <w:tab w:val="left" w:pos="433"/>
           <w:tab w:val="left" w:pos="446"/>
@@ -4450,6 +4585,7 @@
           <w:tab w:val="left" w:pos="6934"/>
         </w:tabs>
         <w:spacing w:before="206" w:line="403" w:lineRule="auto"/>
+        <w:ind w:left="447" w:firstLine="0"/>
         <w:rPr>
           <w:position w:val="1"/>
           <w:sz w:val="20"/>
@@ -4459,9 +4595,66 @@
         <w:rPr>
           <w:sz w:val="20"/>
         </w:rPr>
+        <w:t xml:space="preserve">If the appeal involves a motion to suppress, did the judge enter findings?  </w:t>
+      </w:r>
+      <w:proofErr w:type="gramStart"/>
+      <w:r>
+        <w:rPr>
+          <w:sz w:val="20"/>
+        </w:rPr>
+        <w:t>{{ “</w:t>
+      </w:r>
+      <w:proofErr w:type="gramEnd"/>
+      <w:r>
+        <w:rPr>
+          <w:sz w:val="20"/>
+        </w:rPr>
+        <w:t>Yes” if motion_findings else “No</w:t>
+      </w:r>
+      <w:proofErr w:type="gramStart"/>
+      <w:r>
+        <w:rPr>
+          <w:sz w:val="20"/>
+        </w:rPr>
+        <w:t>” }</w:t>
+      </w:r>
+      <w:proofErr w:type="gramEnd"/>
+      <w:r>
+        <w:rPr>
+          <w:sz w:val="20"/>
+        </w:rPr>
+        <w:t>}</w:t>
+      </w:r>
+    </w:p>
+    <w:p>
+      <w:pPr>
+        <w:tabs>
+          <w:tab w:val="left" w:pos="433"/>
+          <w:tab w:val="left" w:pos="446"/>
+          <w:tab w:val="left" w:pos="2634"/>
+          <w:tab w:val="left" w:pos="6934"/>
+        </w:tabs>
+        <w:spacing w:before="206" w:line="403" w:lineRule="auto"/>
+        <w:rPr>
+          <w:position w:val="1"/>
+          <w:sz w:val="20"/>
+        </w:rPr>
+      </w:pPr>
+      <w:r>
+        <w:rPr>
+          <w:sz w:val="20"/>
+        </w:rPr>
         <w:tab/>
-        <w:t>If yes, are the findings: {{ "</w:t>
-      </w:r>
+        <w:t xml:space="preserve">If yes, are the findings: </w:t>
+      </w:r>
+      <w:proofErr w:type="gramStart"/>
+      <w:r>
+        <w:rPr>
+          <w:sz w:val="20"/>
+        </w:rPr>
+        <w:t>{{ "</w:t>
+      </w:r>
+      <w:proofErr w:type="gramEnd"/>
       <w:r>
         <w:rPr>
           <w:rFonts w:ascii="Segoe UI Symbol" w:hAnsi="Segoe UI Symbol" w:cs="Segoe UI Symbol"/>
@@ -4482,12 +4675,28 @@
         </w:rPr>
         <w:t>☐</w:t>
       </w:r>
-      <w:r>
-        <w:rPr>
-          <w:sz w:val="20"/>
-        </w:rPr>
-        <w:t>" }} Written {{ "</w:t>
-      </w:r>
+      <w:proofErr w:type="gramStart"/>
+      <w:r>
+        <w:rPr>
+          <w:sz w:val="20"/>
+        </w:rPr>
+        <w:t>" }</w:t>
+      </w:r>
+      <w:proofErr w:type="gramEnd"/>
+      <w:r>
+        <w:rPr>
+          <w:sz w:val="20"/>
+        </w:rPr>
+        <w:t xml:space="preserve">} Written </w:t>
+      </w:r>
+      <w:proofErr w:type="gramStart"/>
+      <w:r>
+        <w:rPr>
+          <w:sz w:val="20"/>
+        </w:rPr>
+        <w:t>{{ "</w:t>
+      </w:r>
+      <w:proofErr w:type="gramEnd"/>
       <w:r>
         <w:rPr>
           <w:rFonts w:ascii="Segoe UI Symbol" w:hAnsi="Segoe UI Symbol" w:cs="Segoe UI Symbol"/>
@@ -4508,11 +4717,19 @@
         </w:rPr>
         <w:t>☐</w:t>
       </w:r>
-      <w:r>
-        <w:rPr>
-          <w:sz w:val="20"/>
-        </w:rPr>
-        <w:t>" }} Transcribed</w:t>
+      <w:proofErr w:type="gramStart"/>
+      <w:r>
+        <w:rPr>
+          <w:sz w:val="20"/>
+        </w:rPr>
+        <w:t>" }</w:t>
+      </w:r>
+      <w:proofErr w:type="gramEnd"/>
+      <w:r>
+        <w:rPr>
+          <w:sz w:val="20"/>
+        </w:rPr>
+        <w:t>} Transcribed</w:t>
       </w:r>
     </w:p>
     <w:p>
@@ -6053,7 +6270,140 @@
         <w:rPr>
           <w:sz w:val="19"/>
         </w:rPr>
-        <w:t>/s/ {{ users[0].signature }}</w:t>
+        <w:t xml:space="preserve">/s/ </w:t>
+      </w:r>
+      <w:proofErr w:type="gramStart"/>
+      <w:r>
+        <w:rPr>
+          <w:sz w:val="19"/>
+        </w:rPr>
+        <w:t>{{ users</w:t>
+      </w:r>
+      <w:proofErr w:type="gramEnd"/>
+      <w:r>
+        <w:rPr>
+          <w:sz w:val="19"/>
+        </w:rPr>
+        <w:t>[0</w:t>
+      </w:r>
+      <w:proofErr w:type="gramStart"/>
+      <w:r>
+        <w:rPr>
+          <w:sz w:val="19"/>
+        </w:rPr>
+        <w:t>].signature</w:t>
+      </w:r>
+      <w:proofErr w:type="gramEnd"/>
+      <w:r>
+        <w:rPr>
+          <w:sz w:val="19"/>
+        </w:rPr>
+        <w:t xml:space="preserve"> }}</w:t>
+      </w:r>
+    </w:p>
+    <w:p>
+      <w:pPr>
+        <w:pStyle w:val="BodyText"/>
+        <w:spacing w:before="206"/>
+        <w:rPr>
+          <w:sz w:val="19"/>
+        </w:rPr>
+      </w:pPr>
+      <w:r>
+        <w:rPr>
+          <w:sz w:val="19"/>
+        </w:rPr>
+        <w:tab/>
+      </w:r>
+      <w:r>
+        <w:rPr>
+          <w:sz w:val="19"/>
+        </w:rPr>
+        <w:tab/>
+      </w:r>
+      <w:r>
+        <w:rPr>
+          <w:sz w:val="19"/>
+        </w:rPr>
+        <w:tab/>
+      </w:r>
+      <w:r>
+        <w:rPr>
+          <w:sz w:val="19"/>
+        </w:rPr>
+        <w:tab/>
+      </w:r>
+      <w:r>
+        <w:rPr>
+          <w:sz w:val="19"/>
+        </w:rPr>
+        <w:tab/>
+      </w:r>
+      <w:r>
+        <w:rPr>
+          <w:sz w:val="19"/>
+        </w:rPr>
+        <w:tab/>
+      </w:r>
+      <w:r>
+        <w:rPr>
+          <w:sz w:val="19"/>
+        </w:rPr>
+        <w:tab/>
+      </w:r>
+      <w:r>
+        <w:rPr>
+          <w:sz w:val="19"/>
+        </w:rPr>
+        <w:tab/>
+      </w:r>
+      <w:r>
+        <w:rPr>
+          <w:sz w:val="19"/>
+        </w:rPr>
+        <w:t xml:space="preserve">Date: </w:t>
+      </w:r>
+      <w:proofErr w:type="gramStart"/>
+      <w:r>
+        <w:rPr>
+          <w:sz w:val="19"/>
+        </w:rPr>
+        <w:t xml:space="preserve">{{ </w:t>
+      </w:r>
+      <w:proofErr w:type="spellStart"/>
+      <w:r>
+        <w:rPr>
+          <w:sz w:val="19"/>
+        </w:rPr>
+        <w:t>signature</w:t>
+      </w:r>
+      <w:proofErr w:type="gramEnd"/>
+      <w:r>
+        <w:rPr>
+          <w:sz w:val="19"/>
+        </w:rPr>
+        <w:t>_</w:t>
+      </w:r>
+      <w:proofErr w:type="gramStart"/>
+      <w:r>
+        <w:rPr>
+          <w:sz w:val="19"/>
+        </w:rPr>
+        <w:t>date</w:t>
+      </w:r>
+      <w:proofErr w:type="spellEnd"/>
+      <w:r>
+        <w:rPr>
+          <w:sz w:val="19"/>
+        </w:rPr>
+        <w:t xml:space="preserve"> }</w:t>
+      </w:r>
+      <w:proofErr w:type="gramEnd"/>
+      <w:r>
+        <w:rPr>
+          <w:sz w:val="19"/>
+        </w:rPr>
+        <w:t>}</w:t>
       </w:r>
     </w:p>
     <w:p>
@@ -8004,7 +8354,7 @@
 </file>
 
 <file path=word/endnotes.xml><?xml version="1.0" encoding="utf-8"?>
-<w:endnotes xmlns:wpc="http://schemas.microsoft.com/office/word/2010/wordprocessingCanvas" xmlns:cx="http://schemas.microsoft.com/office/drawing/2014/chartex" xmlns:cx1="http://schemas.microsoft.com/office/drawing/2015/9/8/chartex" xmlns:cx2="http://schemas.microsoft.com/office/drawing/2015/10/21/chartex" xmlns:cx3="http://schemas.microsoft.com/office/drawing/2016/5/9/chartex" xmlns:cx4="http://schemas.microsoft.com/office/drawing/2016/5/10/chartex" xmlns:cx5="http://schemas.microsoft.com/office/drawing/2016/5/11/chartex" xmlns:cx6="http://schemas.microsoft.com/office/drawing/2016/5/12/chartex" xmlns:cx7="http://schemas.microsoft.com/office/drawing/2016/5/13/chartex" xmlns:cx8="http://schemas.microsoft.com/office/drawing/2016/5/14/chartex" xmlns:mc="http://schemas.openxmlformats.org/markup-compatibility/2006" xmlns:aink="http://schemas.microsoft.com/office/drawing/2016/ink" xmlns:am3d="http://schemas.microsoft.com/office/drawing/2017/model3d" xmlns:o="urn:schemas-microsoft-com:office:office" xmlns:oel="http://schemas.microsoft.com/office/2019/extlst" xmlns:r="http://schemas.openxmlformats.org/officeDocument/2006/relationships" xmlns:m="http://schemas.openxmlformats.org/officeDocument/2006/math" xmlns:v="urn:schemas-microsoft-com:vml" xmlns:wp14="http://schemas.microsoft.com/office/word/2010/wordprocessingDrawing" xmlns:wp="http://schemas.openxmlformats.org/drawingml/2006/wordprocessingDrawing" xmlns:w10="urn:schemas-microsoft-com:office:word" xmlns:w="http://schemas.openxmlformats.org/wordprocessingml/2006/main" xmlns:w14="http://schemas.microsoft.com/office/word/2010/wordml" xmlns:w15="http://schemas.microsoft.com/office/word/2012/wordml" xmlns:w16cex="http://schemas.microsoft.com/office/word/2018/wordml/cex" xmlns:w16cid="http://schemas.microsoft.com/office/word/2016/wordml/cid" xmlns:w16="http://schemas.microsoft.com/office/word/2018/wordml" xmlns:w16du="http://schemas.microsoft.com/office/word/2023/wordml/word16du" xmlns:w16sdtdh="http://schemas.microsoft.com/office/word/2020/wordml/sdtdatahash" xmlns:w16se="http://schemas.microsoft.com/office/word/2015/wordml/symex" xmlns:wpg="http://schemas.microsoft.com/office/word/2010/wordprocessingGroup" xmlns:wpi="http://schemas.microsoft.com/office/word/2010/wordprocessingInk" xmlns:wne="http://schemas.microsoft.com/office/word/2006/wordml" xmlns:wps="http://schemas.microsoft.com/office/word/2010/wordprocessingShape" mc:Ignorable="w14 w15 w16se w16cid w16 w16cex w16sdtdh w16du wp14">
+<w:endnotes xmlns:wpc="http://schemas.microsoft.com/office/word/2010/wordprocessingCanvas" xmlns:cx="http://schemas.microsoft.com/office/drawing/2014/chartex" xmlns:cx1="http://schemas.microsoft.com/office/drawing/2015/9/8/chartex" xmlns:cx2="http://schemas.microsoft.com/office/drawing/2015/10/21/chartex" xmlns:cx3="http://schemas.microsoft.com/office/drawing/2016/5/9/chartex" xmlns:cx4="http://schemas.microsoft.com/office/drawing/2016/5/10/chartex" xmlns:cx5="http://schemas.microsoft.com/office/drawing/2016/5/11/chartex" xmlns:cx6="http://schemas.microsoft.com/office/drawing/2016/5/12/chartex" xmlns:cx7="http://schemas.microsoft.com/office/drawing/2016/5/13/chartex" xmlns:cx8="http://schemas.microsoft.com/office/drawing/2016/5/14/chartex" xmlns:mc="http://schemas.openxmlformats.org/markup-compatibility/2006" xmlns:m="http://schemas.openxmlformats.org/officeDocument/2006/math" xmlns:aink="http://schemas.microsoft.com/office/drawing/2016/ink" xmlns:am3d="http://schemas.microsoft.com/office/drawing/2017/model3d" xmlns:oel="http://schemas.microsoft.com/office/2019/extlst" xmlns:r="http://schemas.openxmlformats.org/officeDocument/2006/relationships" xmlns:wp14="http://schemas.microsoft.com/office/word/2010/wordprocessingDrawing" xmlns:wp="http://schemas.openxmlformats.org/drawingml/2006/wordprocessingDrawing" xmlns:wpg="http://schemas.microsoft.com/office/word/2010/wordprocessingGroup" xmlns:wpi="http://schemas.microsoft.com/office/word/2010/wordprocessingInk" xmlns:wps="http://schemas.microsoft.com/office/word/2010/wordprocessingShape" xmlns:o="urn:schemas-microsoft-com:office:office" xmlns:v="urn:schemas-microsoft-com:vml" xmlns:w10="urn:schemas-microsoft-com:office:word" xmlns:w="http://schemas.openxmlformats.org/wordprocessingml/2006/main" xmlns:w14="http://schemas.microsoft.com/office/word/2010/wordml" xmlns:w15="http://schemas.microsoft.com/office/word/2012/wordml" xmlns:w16cex="http://schemas.microsoft.com/office/word/2018/wordml/cex" xmlns:w16cid="http://schemas.microsoft.com/office/word/2016/wordml/cid" xmlns:w16="http://schemas.microsoft.com/office/word/2018/wordml" xmlns:w16sdtdh="http://schemas.microsoft.com/office/word/2020/wordml/sdtdatahash" xmlns:w16sdtfl="http://schemas.microsoft.com/office/word/2024/wordml/sdtformatlock" xmlns:w16se="http://schemas.microsoft.com/office/word/2015/wordml/symex" xmlns:w16du="http://schemas.microsoft.com/office/word/2023/wordml/word16du" xmlns:wne="http://schemas.microsoft.com/office/word/2006/wordml" mc:Ignorable="w14 w15 w16se w16cid w16 w16cex w16sdtdh w16sdtfl w16du wp14">
   <w:endnote w:type="separator" w:id="-1">
     <w:p>
       <w:r>
@@ -8023,7 +8373,7 @@
 </file>
 
 <file path=word/footer1.xml><?xml version="1.0" encoding="utf-8"?>
-<w:ftr xmlns:wpc="http://schemas.microsoft.com/office/word/2010/wordprocessingCanvas" xmlns:cx="http://schemas.microsoft.com/office/drawing/2014/chartex" xmlns:cx1="http://schemas.microsoft.com/office/drawing/2015/9/8/chartex" xmlns:cx2="http://schemas.microsoft.com/office/drawing/2015/10/21/chartex" xmlns:cx3="http://schemas.microsoft.com/office/drawing/2016/5/9/chartex" xmlns:cx4="http://schemas.microsoft.com/office/drawing/2016/5/10/chartex" xmlns:cx5="http://schemas.microsoft.com/office/drawing/2016/5/11/chartex" xmlns:cx6="http://schemas.microsoft.com/office/drawing/2016/5/12/chartex" xmlns:cx7="http://schemas.microsoft.com/office/drawing/2016/5/13/chartex" xmlns:cx8="http://schemas.microsoft.com/office/drawing/2016/5/14/chartex" xmlns:mc="http://schemas.openxmlformats.org/markup-compatibility/2006" xmlns:aink="http://schemas.microsoft.com/office/drawing/2016/ink" xmlns:am3d="http://schemas.microsoft.com/office/drawing/2017/model3d" xmlns:o="urn:schemas-microsoft-com:office:office" xmlns:oel="http://schemas.microsoft.com/office/2019/extlst" xmlns:r="http://schemas.openxmlformats.org/officeDocument/2006/relationships" xmlns:m="http://schemas.openxmlformats.org/officeDocument/2006/math" xmlns:v="urn:schemas-microsoft-com:vml" xmlns:wp14="http://schemas.microsoft.com/office/word/2010/wordprocessingDrawing" xmlns:wp="http://schemas.openxmlformats.org/drawingml/2006/wordprocessingDrawing" xmlns:w10="urn:schemas-microsoft-com:office:word" xmlns:w="http://schemas.openxmlformats.org/wordprocessingml/2006/main" xmlns:w14="http://schemas.microsoft.com/office/word/2010/wordml" xmlns:w15="http://schemas.microsoft.com/office/word/2012/wordml" xmlns:w16cex="http://schemas.microsoft.com/office/word/2018/wordml/cex" xmlns:w16cid="http://schemas.microsoft.com/office/word/2016/wordml/cid" xmlns:w16="http://schemas.microsoft.com/office/word/2018/wordml" xmlns:w16du="http://schemas.microsoft.com/office/word/2023/wordml/word16du" xmlns:w16sdtdh="http://schemas.microsoft.com/office/word/2020/wordml/sdtdatahash" xmlns:w16se="http://schemas.microsoft.com/office/word/2015/wordml/symex" xmlns:wpg="http://schemas.microsoft.com/office/word/2010/wordprocessingGroup" xmlns:wpi="http://schemas.microsoft.com/office/word/2010/wordprocessingInk" xmlns:wne="http://schemas.microsoft.com/office/word/2006/wordml" xmlns:wps="http://schemas.microsoft.com/office/word/2010/wordprocessingShape" mc:Ignorable="w14 w15 w16se w16cid w16 w16cex w16sdtdh w16du wp14">
+<w:ftr xmlns:wpc="http://schemas.microsoft.com/office/word/2010/wordprocessingCanvas" xmlns:cx="http://schemas.microsoft.com/office/drawing/2014/chartex" xmlns:cx1="http://schemas.microsoft.com/office/drawing/2015/9/8/chartex" xmlns:cx2="http://schemas.microsoft.com/office/drawing/2015/10/21/chartex" xmlns:cx3="http://schemas.microsoft.com/office/drawing/2016/5/9/chartex" xmlns:cx4="http://schemas.microsoft.com/office/drawing/2016/5/10/chartex" xmlns:cx5="http://schemas.microsoft.com/office/drawing/2016/5/11/chartex" xmlns:cx6="http://schemas.microsoft.com/office/drawing/2016/5/12/chartex" xmlns:cx7="http://schemas.microsoft.com/office/drawing/2016/5/13/chartex" xmlns:cx8="http://schemas.microsoft.com/office/drawing/2016/5/14/chartex" xmlns:mc="http://schemas.openxmlformats.org/markup-compatibility/2006" xmlns:m="http://schemas.openxmlformats.org/officeDocument/2006/math" xmlns:aink="http://schemas.microsoft.com/office/drawing/2016/ink" xmlns:am3d="http://schemas.microsoft.com/office/drawing/2017/model3d" xmlns:oel="http://schemas.microsoft.com/office/2019/extlst" xmlns:r="http://schemas.openxmlformats.org/officeDocument/2006/relationships" xmlns:wp14="http://schemas.microsoft.com/office/word/2010/wordprocessingDrawing" xmlns:wp="http://schemas.openxmlformats.org/drawingml/2006/wordprocessingDrawing" xmlns:wpg="http://schemas.microsoft.com/office/word/2010/wordprocessingGroup" xmlns:wpi="http://schemas.microsoft.com/office/word/2010/wordprocessingInk" xmlns:wps="http://schemas.microsoft.com/office/word/2010/wordprocessingShape" xmlns:o="urn:schemas-microsoft-com:office:office" xmlns:v="urn:schemas-microsoft-com:vml" xmlns:w10="urn:schemas-microsoft-com:office:word" xmlns:w="http://schemas.openxmlformats.org/wordprocessingml/2006/main" xmlns:w14="http://schemas.microsoft.com/office/word/2010/wordml" xmlns:w15="http://schemas.microsoft.com/office/word/2012/wordml" xmlns:w16cex="http://schemas.microsoft.com/office/word/2018/wordml/cex" xmlns:w16cid="http://schemas.microsoft.com/office/word/2016/wordml/cid" xmlns:w16="http://schemas.microsoft.com/office/word/2018/wordml" xmlns:w16sdtdh="http://schemas.microsoft.com/office/word/2020/wordml/sdtdatahash" xmlns:w16sdtfl="http://schemas.microsoft.com/office/word/2024/wordml/sdtformatlock" xmlns:w16se="http://schemas.microsoft.com/office/word/2015/wordml/symex" xmlns:w16du="http://schemas.microsoft.com/office/word/2023/wordml/word16du" xmlns:wne="http://schemas.microsoft.com/office/word/2006/wordml" mc:Ignorable="w14 w15 w16se w16cid w16 w16cex w16sdtdh w16sdtfl w16du wp14">
   <w:sdt>
     <w:sdtPr>
       <w:rPr>
@@ -8115,7 +8465,7 @@
 </file>
 
 <file path=word/footer2.xml><?xml version="1.0" encoding="utf-8"?>
-<w:ftr xmlns:wpc="http://schemas.microsoft.com/office/word/2010/wordprocessingCanvas" xmlns:cx="http://schemas.microsoft.com/office/drawing/2014/chartex" xmlns:cx1="http://schemas.microsoft.com/office/drawing/2015/9/8/chartex" xmlns:cx2="http://schemas.microsoft.com/office/drawing/2015/10/21/chartex" xmlns:cx3="http://schemas.microsoft.com/office/drawing/2016/5/9/chartex" xmlns:cx4="http://schemas.microsoft.com/office/drawing/2016/5/10/chartex" xmlns:cx5="http://schemas.microsoft.com/office/drawing/2016/5/11/chartex" xmlns:cx6="http://schemas.microsoft.com/office/drawing/2016/5/12/chartex" xmlns:cx7="http://schemas.microsoft.com/office/drawing/2016/5/13/chartex" xmlns:cx8="http://schemas.microsoft.com/office/drawing/2016/5/14/chartex" xmlns:mc="http://schemas.openxmlformats.org/markup-compatibility/2006" xmlns:aink="http://schemas.microsoft.com/office/drawing/2016/ink" xmlns:am3d="http://schemas.microsoft.com/office/drawing/2017/model3d" xmlns:o="urn:schemas-microsoft-com:office:office" xmlns:oel="http://schemas.microsoft.com/office/2019/extlst" xmlns:r="http://schemas.openxmlformats.org/officeDocument/2006/relationships" xmlns:m="http://schemas.openxmlformats.org/officeDocument/2006/math" xmlns:v="urn:schemas-microsoft-com:vml" xmlns:wp14="http://schemas.microsoft.com/office/word/2010/wordprocessingDrawing" xmlns:wp="http://schemas.openxmlformats.org/drawingml/2006/wordprocessingDrawing" xmlns:w10="urn:schemas-microsoft-com:office:word" xmlns:w="http://schemas.openxmlformats.org/wordprocessingml/2006/main" xmlns:w14="http://schemas.microsoft.com/office/word/2010/wordml" xmlns:w15="http://schemas.microsoft.com/office/word/2012/wordml" xmlns:w16cex="http://schemas.microsoft.com/office/word/2018/wordml/cex" xmlns:w16cid="http://schemas.microsoft.com/office/word/2016/wordml/cid" xmlns:w16="http://schemas.microsoft.com/office/word/2018/wordml" xmlns:w16du="http://schemas.microsoft.com/office/word/2023/wordml/word16du" xmlns:w16sdtdh="http://schemas.microsoft.com/office/word/2020/wordml/sdtdatahash" xmlns:w16se="http://schemas.microsoft.com/office/word/2015/wordml/symex" xmlns:wpg="http://schemas.microsoft.com/office/word/2010/wordprocessingGroup" xmlns:wpi="http://schemas.microsoft.com/office/word/2010/wordprocessingInk" xmlns:wne="http://schemas.microsoft.com/office/word/2006/wordml" xmlns:wps="http://schemas.microsoft.com/office/word/2010/wordprocessingShape" mc:Ignorable="w14 w15 w16se w16cid w16 w16cex w16sdtdh w16du wp14">
+<w:ftr xmlns:wpc="http://schemas.microsoft.com/office/word/2010/wordprocessingCanvas" xmlns:cx="http://schemas.microsoft.com/office/drawing/2014/chartex" xmlns:cx1="http://schemas.microsoft.com/office/drawing/2015/9/8/chartex" xmlns:cx2="http://schemas.microsoft.com/office/drawing/2015/10/21/chartex" xmlns:cx3="http://schemas.microsoft.com/office/drawing/2016/5/9/chartex" xmlns:cx4="http://schemas.microsoft.com/office/drawing/2016/5/10/chartex" xmlns:cx5="http://schemas.microsoft.com/office/drawing/2016/5/11/chartex" xmlns:cx6="http://schemas.microsoft.com/office/drawing/2016/5/12/chartex" xmlns:cx7="http://schemas.microsoft.com/office/drawing/2016/5/13/chartex" xmlns:cx8="http://schemas.microsoft.com/office/drawing/2016/5/14/chartex" xmlns:mc="http://schemas.openxmlformats.org/markup-compatibility/2006" xmlns:m="http://schemas.openxmlformats.org/officeDocument/2006/math" xmlns:aink="http://schemas.microsoft.com/office/drawing/2016/ink" xmlns:am3d="http://schemas.microsoft.com/office/drawing/2017/model3d" xmlns:oel="http://schemas.microsoft.com/office/2019/extlst" xmlns:r="http://schemas.openxmlformats.org/officeDocument/2006/relationships" xmlns:wp14="http://schemas.microsoft.com/office/word/2010/wordprocessingDrawing" xmlns:wp="http://schemas.openxmlformats.org/drawingml/2006/wordprocessingDrawing" xmlns:wpg="http://schemas.microsoft.com/office/word/2010/wordprocessingGroup" xmlns:wpi="http://schemas.microsoft.com/office/word/2010/wordprocessingInk" xmlns:wps="http://schemas.microsoft.com/office/word/2010/wordprocessingShape" xmlns:o="urn:schemas-microsoft-com:office:office" xmlns:v="urn:schemas-microsoft-com:vml" xmlns:w10="urn:schemas-microsoft-com:office:word" xmlns:w="http://schemas.openxmlformats.org/wordprocessingml/2006/main" xmlns:w14="http://schemas.microsoft.com/office/word/2010/wordml" xmlns:w15="http://schemas.microsoft.com/office/word/2012/wordml" xmlns:w16cex="http://schemas.microsoft.com/office/word/2018/wordml/cex" xmlns:w16cid="http://schemas.microsoft.com/office/word/2016/wordml/cid" xmlns:w16="http://schemas.microsoft.com/office/word/2018/wordml" xmlns:w16sdtdh="http://schemas.microsoft.com/office/word/2020/wordml/sdtdatahash" xmlns:w16sdtfl="http://schemas.microsoft.com/office/word/2024/wordml/sdtformatlock" xmlns:w16se="http://schemas.microsoft.com/office/word/2015/wordml/symex" xmlns:w16du="http://schemas.microsoft.com/office/word/2023/wordml/word16du" xmlns:wne="http://schemas.microsoft.com/office/word/2006/wordml" mc:Ignorable="w14 w15 w16se w16cid w16 w16cex w16sdtdh w16sdtfl w16du wp14">
   <w:p>
     <w:pPr>
       <w:pStyle w:val="BodyText"/>
@@ -8173,7 +8523,6 @@
                               <w:sz w:val="20"/>
                             </w:rPr>
                           </w:pPr>
-                          <w:proofErr w:type="spellStart"/>
                           <w:r>
                             <w:rPr>
                               <w:rFonts w:ascii="Arial"/>
@@ -8181,7 +8530,6 @@
                             </w:rPr>
                             <w:t>APC001</w:t>
                           </w:r>
-                          <w:proofErr w:type="spellEnd"/>
                           <w:r>
                             <w:rPr>
                               <w:rFonts w:ascii="Arial"/>
@@ -8267,7 +8615,7 @@
 </file>
 
 <file path=word/footer3.xml><?xml version="1.0" encoding="utf-8"?>
-<w:ftr xmlns:wpc="http://schemas.microsoft.com/office/word/2010/wordprocessingCanvas" xmlns:cx="http://schemas.microsoft.com/office/drawing/2014/chartex" xmlns:cx1="http://schemas.microsoft.com/office/drawing/2015/9/8/chartex" xmlns:cx2="http://schemas.microsoft.com/office/drawing/2015/10/21/chartex" xmlns:cx3="http://schemas.microsoft.com/office/drawing/2016/5/9/chartex" xmlns:cx4="http://schemas.microsoft.com/office/drawing/2016/5/10/chartex" xmlns:cx5="http://schemas.microsoft.com/office/drawing/2016/5/11/chartex" xmlns:cx6="http://schemas.microsoft.com/office/drawing/2016/5/12/chartex" xmlns:cx7="http://schemas.microsoft.com/office/drawing/2016/5/13/chartex" xmlns:cx8="http://schemas.microsoft.com/office/drawing/2016/5/14/chartex" xmlns:mc="http://schemas.openxmlformats.org/markup-compatibility/2006" xmlns:aink="http://schemas.microsoft.com/office/drawing/2016/ink" xmlns:am3d="http://schemas.microsoft.com/office/drawing/2017/model3d" xmlns:o="urn:schemas-microsoft-com:office:office" xmlns:oel="http://schemas.microsoft.com/office/2019/extlst" xmlns:r="http://schemas.openxmlformats.org/officeDocument/2006/relationships" xmlns:m="http://schemas.openxmlformats.org/officeDocument/2006/math" xmlns:v="urn:schemas-microsoft-com:vml" xmlns:wp14="http://schemas.microsoft.com/office/word/2010/wordprocessingDrawing" xmlns:wp="http://schemas.openxmlformats.org/drawingml/2006/wordprocessingDrawing" xmlns:w10="urn:schemas-microsoft-com:office:word" xmlns:w="http://schemas.openxmlformats.org/wordprocessingml/2006/main" xmlns:w14="http://schemas.microsoft.com/office/word/2010/wordml" xmlns:w15="http://schemas.microsoft.com/office/word/2012/wordml" xmlns:w16cex="http://schemas.microsoft.com/office/word/2018/wordml/cex" xmlns:w16cid="http://schemas.microsoft.com/office/word/2016/wordml/cid" xmlns:w16="http://schemas.microsoft.com/office/word/2018/wordml" xmlns:w16du="http://schemas.microsoft.com/office/word/2023/wordml/word16du" xmlns:w16sdtdh="http://schemas.microsoft.com/office/word/2020/wordml/sdtdatahash" xmlns:w16se="http://schemas.microsoft.com/office/word/2015/wordml/symex" xmlns:wpg="http://schemas.microsoft.com/office/word/2010/wordprocessingGroup" xmlns:wpi="http://schemas.microsoft.com/office/word/2010/wordprocessingInk" xmlns:wne="http://schemas.microsoft.com/office/word/2006/wordml" xmlns:wps="http://schemas.microsoft.com/office/word/2010/wordprocessingShape" mc:Ignorable="w14 w15 w16se w16cid w16 w16cex w16sdtdh w16du wp14">
+<w:ftr xmlns:wpc="http://schemas.microsoft.com/office/word/2010/wordprocessingCanvas" xmlns:cx="http://schemas.microsoft.com/office/drawing/2014/chartex" xmlns:cx1="http://schemas.microsoft.com/office/drawing/2015/9/8/chartex" xmlns:cx2="http://schemas.microsoft.com/office/drawing/2015/10/21/chartex" xmlns:cx3="http://schemas.microsoft.com/office/drawing/2016/5/9/chartex" xmlns:cx4="http://schemas.microsoft.com/office/drawing/2016/5/10/chartex" xmlns:cx5="http://schemas.microsoft.com/office/drawing/2016/5/11/chartex" xmlns:cx6="http://schemas.microsoft.com/office/drawing/2016/5/12/chartex" xmlns:cx7="http://schemas.microsoft.com/office/drawing/2016/5/13/chartex" xmlns:cx8="http://schemas.microsoft.com/office/drawing/2016/5/14/chartex" xmlns:mc="http://schemas.openxmlformats.org/markup-compatibility/2006" xmlns:m="http://schemas.openxmlformats.org/officeDocument/2006/math" xmlns:aink="http://schemas.microsoft.com/office/drawing/2016/ink" xmlns:am3d="http://schemas.microsoft.com/office/drawing/2017/model3d" xmlns:oel="http://schemas.microsoft.com/office/2019/extlst" xmlns:r="http://schemas.openxmlformats.org/officeDocument/2006/relationships" xmlns:wp14="http://schemas.microsoft.com/office/word/2010/wordprocessingDrawing" xmlns:wp="http://schemas.openxmlformats.org/drawingml/2006/wordprocessingDrawing" xmlns:wpg="http://schemas.microsoft.com/office/word/2010/wordprocessingGroup" xmlns:wpi="http://schemas.microsoft.com/office/word/2010/wordprocessingInk" xmlns:wps="http://schemas.microsoft.com/office/word/2010/wordprocessingShape" xmlns:o="urn:schemas-microsoft-com:office:office" xmlns:v="urn:schemas-microsoft-com:vml" xmlns:w10="urn:schemas-microsoft-com:office:word" xmlns:w="http://schemas.openxmlformats.org/wordprocessingml/2006/main" xmlns:w14="http://schemas.microsoft.com/office/word/2010/wordml" xmlns:w15="http://schemas.microsoft.com/office/word/2012/wordml" xmlns:w16cex="http://schemas.microsoft.com/office/word/2018/wordml/cex" xmlns:w16cid="http://schemas.microsoft.com/office/word/2016/wordml/cid" xmlns:w16="http://schemas.microsoft.com/office/word/2018/wordml" xmlns:w16sdtdh="http://schemas.microsoft.com/office/word/2020/wordml/sdtdatahash" xmlns:w16sdtfl="http://schemas.microsoft.com/office/word/2024/wordml/sdtformatlock" xmlns:w16se="http://schemas.microsoft.com/office/word/2015/wordml/symex" xmlns:w16du="http://schemas.microsoft.com/office/word/2023/wordml/word16du" xmlns:wne="http://schemas.microsoft.com/office/word/2006/wordml" mc:Ignorable="w14 w15 w16se w16cid w16 w16cex w16sdtdh w16sdtfl w16du wp14">
   <w:p>
     <w:pPr>
       <w:pStyle w:val="Footer"/>
@@ -8277,7 +8625,7 @@
 </file>
 
 <file path=word/footer4.xml><?xml version="1.0" encoding="utf-8"?>
-<w:ftr xmlns:wpc="http://schemas.microsoft.com/office/word/2010/wordprocessingCanvas" xmlns:cx="http://schemas.microsoft.com/office/drawing/2014/chartex" xmlns:cx1="http://schemas.microsoft.com/office/drawing/2015/9/8/chartex" xmlns:cx2="http://schemas.microsoft.com/office/drawing/2015/10/21/chartex" xmlns:cx3="http://schemas.microsoft.com/office/drawing/2016/5/9/chartex" xmlns:cx4="http://schemas.microsoft.com/office/drawing/2016/5/10/chartex" xmlns:cx5="http://schemas.microsoft.com/office/drawing/2016/5/11/chartex" xmlns:cx6="http://schemas.microsoft.com/office/drawing/2016/5/12/chartex" xmlns:cx7="http://schemas.microsoft.com/office/drawing/2016/5/13/chartex" xmlns:cx8="http://schemas.microsoft.com/office/drawing/2016/5/14/chartex" xmlns:mc="http://schemas.openxmlformats.org/markup-compatibility/2006" xmlns:aink="http://schemas.microsoft.com/office/drawing/2016/ink" xmlns:am3d="http://schemas.microsoft.com/office/drawing/2017/model3d" xmlns:o="urn:schemas-microsoft-com:office:office" xmlns:oel="http://schemas.microsoft.com/office/2019/extlst" xmlns:r="http://schemas.openxmlformats.org/officeDocument/2006/relationships" xmlns:m="http://schemas.openxmlformats.org/officeDocument/2006/math" xmlns:v="urn:schemas-microsoft-com:vml" xmlns:wp14="http://schemas.microsoft.com/office/word/2010/wordprocessingDrawing" xmlns:wp="http://schemas.openxmlformats.org/drawingml/2006/wordprocessingDrawing" xmlns:w10="urn:schemas-microsoft-com:office:word" xmlns:w="http://schemas.openxmlformats.org/wordprocessingml/2006/main" xmlns:w14="http://schemas.microsoft.com/office/word/2010/wordml" xmlns:w15="http://schemas.microsoft.com/office/word/2012/wordml" xmlns:w16cex="http://schemas.microsoft.com/office/word/2018/wordml/cex" xmlns:w16cid="http://schemas.microsoft.com/office/word/2016/wordml/cid" xmlns:w16="http://schemas.microsoft.com/office/word/2018/wordml" xmlns:w16du="http://schemas.microsoft.com/office/word/2023/wordml/word16du" xmlns:w16sdtdh="http://schemas.microsoft.com/office/word/2020/wordml/sdtdatahash" xmlns:w16se="http://schemas.microsoft.com/office/word/2015/wordml/symex" xmlns:wpg="http://schemas.microsoft.com/office/word/2010/wordprocessingGroup" xmlns:wpi="http://schemas.microsoft.com/office/word/2010/wordprocessingInk" xmlns:wne="http://schemas.microsoft.com/office/word/2006/wordml" xmlns:wps="http://schemas.microsoft.com/office/word/2010/wordprocessingShape" mc:Ignorable="w14 w15 w16se w16cid w16 w16cex w16sdtdh w16du wp14">
+<w:ftr xmlns:wpc="http://schemas.microsoft.com/office/word/2010/wordprocessingCanvas" xmlns:cx="http://schemas.microsoft.com/office/drawing/2014/chartex" xmlns:cx1="http://schemas.microsoft.com/office/drawing/2015/9/8/chartex" xmlns:cx2="http://schemas.microsoft.com/office/drawing/2015/10/21/chartex" xmlns:cx3="http://schemas.microsoft.com/office/drawing/2016/5/9/chartex" xmlns:cx4="http://schemas.microsoft.com/office/drawing/2016/5/10/chartex" xmlns:cx5="http://schemas.microsoft.com/office/drawing/2016/5/11/chartex" xmlns:cx6="http://schemas.microsoft.com/office/drawing/2016/5/12/chartex" xmlns:cx7="http://schemas.microsoft.com/office/drawing/2016/5/13/chartex" xmlns:cx8="http://schemas.microsoft.com/office/drawing/2016/5/14/chartex" xmlns:mc="http://schemas.openxmlformats.org/markup-compatibility/2006" xmlns:m="http://schemas.openxmlformats.org/officeDocument/2006/math" xmlns:aink="http://schemas.microsoft.com/office/drawing/2016/ink" xmlns:am3d="http://schemas.microsoft.com/office/drawing/2017/model3d" xmlns:oel="http://schemas.microsoft.com/office/2019/extlst" xmlns:r="http://schemas.openxmlformats.org/officeDocument/2006/relationships" xmlns:wp14="http://schemas.microsoft.com/office/word/2010/wordprocessingDrawing" xmlns:wp="http://schemas.openxmlformats.org/drawingml/2006/wordprocessingDrawing" xmlns:wpg="http://schemas.microsoft.com/office/word/2010/wordprocessingGroup" xmlns:wpi="http://schemas.microsoft.com/office/word/2010/wordprocessingInk" xmlns:wps="http://schemas.microsoft.com/office/word/2010/wordprocessingShape" xmlns:o="urn:schemas-microsoft-com:office:office" xmlns:v="urn:schemas-microsoft-com:vml" xmlns:w10="urn:schemas-microsoft-com:office:word" xmlns:w="http://schemas.openxmlformats.org/wordprocessingml/2006/main" xmlns:w14="http://schemas.microsoft.com/office/word/2010/wordml" xmlns:w15="http://schemas.microsoft.com/office/word/2012/wordml" xmlns:w16cex="http://schemas.microsoft.com/office/word/2018/wordml/cex" xmlns:w16cid="http://schemas.microsoft.com/office/word/2016/wordml/cid" xmlns:w16="http://schemas.microsoft.com/office/word/2018/wordml" xmlns:w16sdtdh="http://schemas.microsoft.com/office/word/2020/wordml/sdtdatahash" xmlns:w16sdtfl="http://schemas.microsoft.com/office/word/2024/wordml/sdtformatlock" xmlns:w16se="http://schemas.microsoft.com/office/word/2015/wordml/symex" xmlns:w16du="http://schemas.microsoft.com/office/word/2023/wordml/word16du" xmlns:wne="http://schemas.microsoft.com/office/word/2006/wordml" mc:Ignorable="w14 w15 w16se w16cid w16 w16cex w16sdtdh w16sdtfl w16du wp14">
   <w:p>
     <w:pPr>
       <w:pStyle w:val="BodyText"/>
@@ -8335,7 +8683,6 @@
                               <w:sz w:val="20"/>
                             </w:rPr>
                           </w:pPr>
-                          <w:proofErr w:type="spellStart"/>
                           <w:r>
                             <w:rPr>
                               <w:rFonts w:ascii="Arial"/>
@@ -8343,7 +8690,6 @@
                             </w:rPr>
                             <w:t>APC001</w:t>
                           </w:r>
-                          <w:proofErr w:type="spellEnd"/>
                           <w:r>
                             <w:rPr>
                               <w:rFonts w:ascii="Arial"/>
@@ -8429,7 +8775,7 @@
 </file>
 
 <file path=word/footnotes.xml><?xml version="1.0" encoding="utf-8"?>
-<w:footnotes xmlns:wpc="http://schemas.microsoft.com/office/word/2010/wordprocessingCanvas" xmlns:cx="http://schemas.microsoft.com/office/drawing/2014/chartex" xmlns:cx1="http://schemas.microsoft.com/office/drawing/2015/9/8/chartex" xmlns:cx2="http://schemas.microsoft.com/office/drawing/2015/10/21/chartex" xmlns:cx3="http://schemas.microsoft.com/office/drawing/2016/5/9/chartex" xmlns:cx4="http://schemas.microsoft.com/office/drawing/2016/5/10/chartex" xmlns:cx5="http://schemas.microsoft.com/office/drawing/2016/5/11/chartex" xmlns:cx6="http://schemas.microsoft.com/office/drawing/2016/5/12/chartex" xmlns:cx7="http://schemas.microsoft.com/office/drawing/2016/5/13/chartex" xmlns:cx8="http://schemas.microsoft.com/office/drawing/2016/5/14/chartex" xmlns:mc="http://schemas.openxmlformats.org/markup-compatibility/2006" xmlns:aink="http://schemas.microsoft.com/office/drawing/2016/ink" xmlns:am3d="http://schemas.microsoft.com/office/drawing/2017/model3d" xmlns:o="urn:schemas-microsoft-com:office:office" xmlns:oel="http://schemas.microsoft.com/office/2019/extlst" xmlns:r="http://schemas.openxmlformats.org/officeDocument/2006/relationships" xmlns:m="http://schemas.openxmlformats.org/officeDocument/2006/math" xmlns:v="urn:schemas-microsoft-com:vml" xmlns:wp14="http://schemas.microsoft.com/office/word/2010/wordprocessingDrawing" xmlns:wp="http://schemas.openxmlformats.org/drawingml/2006/wordprocessingDrawing" xmlns:w10="urn:schemas-microsoft-com:office:word" xmlns:w="http://schemas.openxmlformats.org/wordprocessingml/2006/main" xmlns:w14="http://schemas.microsoft.com/office/word/2010/wordml" xmlns:w15="http://schemas.microsoft.com/office/word/2012/wordml" xmlns:w16cex="http://schemas.microsoft.com/office/word/2018/wordml/cex" xmlns:w16cid="http://schemas.microsoft.com/office/word/2016/wordml/cid" xmlns:w16="http://schemas.microsoft.com/office/word/2018/wordml" xmlns:w16du="http://schemas.microsoft.com/office/word/2023/wordml/word16du" xmlns:w16sdtdh="http://schemas.microsoft.com/office/word/2020/wordml/sdtdatahash" xmlns:w16se="http://schemas.microsoft.com/office/word/2015/wordml/symex" xmlns:wpg="http://schemas.microsoft.com/office/word/2010/wordprocessingGroup" xmlns:wpi="http://schemas.microsoft.com/office/word/2010/wordprocessingInk" xmlns:wne="http://schemas.microsoft.com/office/word/2006/wordml" xmlns:wps="http://schemas.microsoft.com/office/word/2010/wordprocessingShape" mc:Ignorable="w14 w15 w16se w16cid w16 w16cex w16sdtdh w16du wp14">
+<w:footnotes xmlns:wpc="http://schemas.microsoft.com/office/word/2010/wordprocessingCanvas" xmlns:cx="http://schemas.microsoft.com/office/drawing/2014/chartex" xmlns:cx1="http://schemas.microsoft.com/office/drawing/2015/9/8/chartex" xmlns:cx2="http://schemas.microsoft.com/office/drawing/2015/10/21/chartex" xmlns:cx3="http://schemas.microsoft.com/office/drawing/2016/5/9/chartex" xmlns:cx4="http://schemas.microsoft.com/office/drawing/2016/5/10/chartex" xmlns:cx5="http://schemas.microsoft.com/office/drawing/2016/5/11/chartex" xmlns:cx6="http://schemas.microsoft.com/office/drawing/2016/5/12/chartex" xmlns:cx7="http://schemas.microsoft.com/office/drawing/2016/5/13/chartex" xmlns:cx8="http://schemas.microsoft.com/office/drawing/2016/5/14/chartex" xmlns:mc="http://schemas.openxmlformats.org/markup-compatibility/2006" xmlns:m="http://schemas.openxmlformats.org/officeDocument/2006/math" xmlns:aink="http://schemas.microsoft.com/office/drawing/2016/ink" xmlns:am3d="http://schemas.microsoft.com/office/drawing/2017/model3d" xmlns:oel="http://schemas.microsoft.com/office/2019/extlst" xmlns:r="http://schemas.openxmlformats.org/officeDocument/2006/relationships" xmlns:wp14="http://schemas.microsoft.com/office/word/2010/wordprocessingDrawing" xmlns:wp="http://schemas.openxmlformats.org/drawingml/2006/wordprocessingDrawing" xmlns:wpg="http://schemas.microsoft.com/office/word/2010/wordprocessingGroup" xmlns:wpi="http://schemas.microsoft.com/office/word/2010/wordprocessingInk" xmlns:wps="http://schemas.microsoft.com/office/word/2010/wordprocessingShape" xmlns:o="urn:schemas-microsoft-com:office:office" xmlns:v="urn:schemas-microsoft-com:vml" xmlns:w10="urn:schemas-microsoft-com:office:word" xmlns:w="http://schemas.openxmlformats.org/wordprocessingml/2006/main" xmlns:w14="http://schemas.microsoft.com/office/word/2010/wordml" xmlns:w15="http://schemas.microsoft.com/office/word/2012/wordml" xmlns:w16cex="http://schemas.microsoft.com/office/word/2018/wordml/cex" xmlns:w16cid="http://schemas.microsoft.com/office/word/2016/wordml/cid" xmlns:w16="http://schemas.microsoft.com/office/word/2018/wordml" xmlns:w16sdtdh="http://schemas.microsoft.com/office/word/2020/wordml/sdtdatahash" xmlns:w16sdtfl="http://schemas.microsoft.com/office/word/2024/wordml/sdtformatlock" xmlns:w16se="http://schemas.microsoft.com/office/word/2015/wordml/symex" xmlns:w16du="http://schemas.microsoft.com/office/word/2023/wordml/word16du" xmlns:wne="http://schemas.microsoft.com/office/word/2006/wordml" mc:Ignorable="w14 w15 w16se w16cid w16 w16cex w16sdtdh w16sdtfl w16du wp14">
   <w:footnote w:type="separator" w:id="-1">
     <w:p>
       <w:r>
@@ -8448,7 +8794,7 @@
 </file>
 
 <file path=word/header1.xml><?xml version="1.0" encoding="utf-8"?>
-<w:hdr xmlns:wpc="http://schemas.microsoft.com/office/word/2010/wordprocessingCanvas" xmlns:cx="http://schemas.microsoft.com/office/drawing/2014/chartex" xmlns:cx1="http://schemas.microsoft.com/office/drawing/2015/9/8/chartex" xmlns:cx2="http://schemas.microsoft.com/office/drawing/2015/10/21/chartex" xmlns:cx3="http://schemas.microsoft.com/office/drawing/2016/5/9/chartex" xmlns:cx4="http://schemas.microsoft.com/office/drawing/2016/5/10/chartex" xmlns:cx5="http://schemas.microsoft.com/office/drawing/2016/5/11/chartex" xmlns:cx6="http://schemas.microsoft.com/office/drawing/2016/5/12/chartex" xmlns:cx7="http://schemas.microsoft.com/office/drawing/2016/5/13/chartex" xmlns:cx8="http://schemas.microsoft.com/office/drawing/2016/5/14/chartex" xmlns:mc="http://schemas.openxmlformats.org/markup-compatibility/2006" xmlns:aink="http://schemas.microsoft.com/office/drawing/2016/ink" xmlns:am3d="http://schemas.microsoft.com/office/drawing/2017/model3d" xmlns:o="urn:schemas-microsoft-com:office:office" xmlns:oel="http://schemas.microsoft.com/office/2019/extlst" xmlns:r="http://schemas.openxmlformats.org/officeDocument/2006/relationships" xmlns:m="http://schemas.openxmlformats.org/officeDocument/2006/math" xmlns:v="urn:schemas-microsoft-com:vml" xmlns:wp14="http://schemas.microsoft.com/office/word/2010/wordprocessingDrawing" xmlns:wp="http://schemas.openxmlformats.org/drawingml/2006/wordprocessingDrawing" xmlns:w10="urn:schemas-microsoft-com:office:word" xmlns:w="http://schemas.openxmlformats.org/wordprocessingml/2006/main" xmlns:w14="http://schemas.microsoft.com/office/word/2010/wordml" xmlns:w15="http://schemas.microsoft.com/office/word/2012/wordml" xmlns:w16cex="http://schemas.microsoft.com/office/word/2018/wordml/cex" xmlns:w16cid="http://schemas.microsoft.com/office/word/2016/wordml/cid" xmlns:w16="http://schemas.microsoft.com/office/word/2018/wordml" xmlns:w16du="http://schemas.microsoft.com/office/word/2023/wordml/word16du" xmlns:w16sdtdh="http://schemas.microsoft.com/office/word/2020/wordml/sdtdatahash" xmlns:w16se="http://schemas.microsoft.com/office/word/2015/wordml/symex" xmlns:wpg="http://schemas.microsoft.com/office/word/2010/wordprocessingGroup" xmlns:wpi="http://schemas.microsoft.com/office/word/2010/wordprocessingInk" xmlns:wne="http://schemas.microsoft.com/office/word/2006/wordml" xmlns:wps="http://schemas.microsoft.com/office/word/2010/wordprocessingShape" mc:Ignorable="w14 w15 w16se w16cid w16 w16cex w16sdtdh w16du wp14">
+<w:hdr xmlns:wpc="http://schemas.microsoft.com/office/word/2010/wordprocessingCanvas" xmlns:cx="http://schemas.microsoft.com/office/drawing/2014/chartex" xmlns:cx1="http://schemas.microsoft.com/office/drawing/2015/9/8/chartex" xmlns:cx2="http://schemas.microsoft.com/office/drawing/2015/10/21/chartex" xmlns:cx3="http://schemas.microsoft.com/office/drawing/2016/5/9/chartex" xmlns:cx4="http://schemas.microsoft.com/office/drawing/2016/5/10/chartex" xmlns:cx5="http://schemas.microsoft.com/office/drawing/2016/5/11/chartex" xmlns:cx6="http://schemas.microsoft.com/office/drawing/2016/5/12/chartex" xmlns:cx7="http://schemas.microsoft.com/office/drawing/2016/5/13/chartex" xmlns:cx8="http://schemas.microsoft.com/office/drawing/2016/5/14/chartex" xmlns:mc="http://schemas.openxmlformats.org/markup-compatibility/2006" xmlns:m="http://schemas.openxmlformats.org/officeDocument/2006/math" xmlns:aink="http://schemas.microsoft.com/office/drawing/2016/ink" xmlns:am3d="http://schemas.microsoft.com/office/drawing/2017/model3d" xmlns:oel="http://schemas.microsoft.com/office/2019/extlst" xmlns:r="http://schemas.openxmlformats.org/officeDocument/2006/relationships" xmlns:wp14="http://schemas.microsoft.com/office/word/2010/wordprocessingDrawing" xmlns:wp="http://schemas.openxmlformats.org/drawingml/2006/wordprocessingDrawing" xmlns:wpg="http://schemas.microsoft.com/office/word/2010/wordprocessingGroup" xmlns:wpi="http://schemas.microsoft.com/office/word/2010/wordprocessingInk" xmlns:wps="http://schemas.microsoft.com/office/word/2010/wordprocessingShape" xmlns:o="urn:schemas-microsoft-com:office:office" xmlns:v="urn:schemas-microsoft-com:vml" xmlns:w10="urn:schemas-microsoft-com:office:word" xmlns:w="http://schemas.openxmlformats.org/wordprocessingml/2006/main" xmlns:w14="http://schemas.microsoft.com/office/word/2010/wordml" xmlns:w15="http://schemas.microsoft.com/office/word/2012/wordml" xmlns:w16cex="http://schemas.microsoft.com/office/word/2018/wordml/cex" xmlns:w16cid="http://schemas.microsoft.com/office/word/2016/wordml/cid" xmlns:w16="http://schemas.microsoft.com/office/word/2018/wordml" xmlns:w16sdtdh="http://schemas.microsoft.com/office/word/2020/wordml/sdtdatahash" xmlns:w16sdtfl="http://schemas.microsoft.com/office/word/2024/wordml/sdtformatlock" xmlns:w16se="http://schemas.microsoft.com/office/word/2015/wordml/symex" xmlns:w16du="http://schemas.microsoft.com/office/word/2023/wordml/word16du" xmlns:wne="http://schemas.microsoft.com/office/word/2006/wordml" mc:Ignorable="w14 w15 w16se w16cid w16 w16cex w16sdtdh w16sdtfl w16du wp14">
   <w:p>
     <w:pPr>
       <w:pStyle w:val="Header"/>
@@ -8458,7 +8804,7 @@
 </file>
 
 <file path=word/header2.xml><?xml version="1.0" encoding="utf-8"?>
-<w:hdr xmlns:wpc="http://schemas.microsoft.com/office/word/2010/wordprocessingCanvas" xmlns:cx="http://schemas.microsoft.com/office/drawing/2014/chartex" xmlns:cx1="http://schemas.microsoft.com/office/drawing/2015/9/8/chartex" xmlns:cx2="http://schemas.microsoft.com/office/drawing/2015/10/21/chartex" xmlns:cx3="http://schemas.microsoft.com/office/drawing/2016/5/9/chartex" xmlns:cx4="http://schemas.microsoft.com/office/drawing/2016/5/10/chartex" xmlns:cx5="http://schemas.microsoft.com/office/drawing/2016/5/11/chartex" xmlns:cx6="http://schemas.microsoft.com/office/drawing/2016/5/12/chartex" xmlns:cx7="http://schemas.microsoft.com/office/drawing/2016/5/13/chartex" xmlns:cx8="http://schemas.microsoft.com/office/drawing/2016/5/14/chartex" xmlns:mc="http://schemas.openxmlformats.org/markup-compatibility/2006" xmlns:aink="http://schemas.microsoft.com/office/drawing/2016/ink" xmlns:am3d="http://schemas.microsoft.com/office/drawing/2017/model3d" xmlns:o="urn:schemas-microsoft-com:office:office" xmlns:oel="http://schemas.microsoft.com/office/2019/extlst" xmlns:r="http://schemas.openxmlformats.org/officeDocument/2006/relationships" xmlns:m="http://schemas.openxmlformats.org/officeDocument/2006/math" xmlns:v="urn:schemas-microsoft-com:vml" xmlns:wp14="http://schemas.microsoft.com/office/word/2010/wordprocessingDrawing" xmlns:wp="http://schemas.openxmlformats.org/drawingml/2006/wordprocessingDrawing" xmlns:w10="urn:schemas-microsoft-com:office:word" xmlns:w="http://schemas.openxmlformats.org/wordprocessingml/2006/main" xmlns:w14="http://schemas.microsoft.com/office/word/2010/wordml" xmlns:w15="http://schemas.microsoft.com/office/word/2012/wordml" xmlns:w16cex="http://schemas.microsoft.com/office/word/2018/wordml/cex" xmlns:w16cid="http://schemas.microsoft.com/office/word/2016/wordml/cid" xmlns:w16="http://schemas.microsoft.com/office/word/2018/wordml" xmlns:w16du="http://schemas.microsoft.com/office/word/2023/wordml/word16du" xmlns:w16sdtdh="http://schemas.microsoft.com/office/word/2020/wordml/sdtdatahash" xmlns:w16se="http://schemas.microsoft.com/office/word/2015/wordml/symex" xmlns:wpg="http://schemas.microsoft.com/office/word/2010/wordprocessingGroup" xmlns:wpi="http://schemas.microsoft.com/office/word/2010/wordprocessingInk" xmlns:wne="http://schemas.microsoft.com/office/word/2006/wordml" xmlns:wps="http://schemas.microsoft.com/office/word/2010/wordprocessingShape" mc:Ignorable="w14 w15 w16se w16cid w16 w16cex w16sdtdh w16du wp14">
+<w:hdr xmlns:wpc="http://schemas.microsoft.com/office/word/2010/wordprocessingCanvas" xmlns:cx="http://schemas.microsoft.com/office/drawing/2014/chartex" xmlns:cx1="http://schemas.microsoft.com/office/drawing/2015/9/8/chartex" xmlns:cx2="http://schemas.microsoft.com/office/drawing/2015/10/21/chartex" xmlns:cx3="http://schemas.microsoft.com/office/drawing/2016/5/9/chartex" xmlns:cx4="http://schemas.microsoft.com/office/drawing/2016/5/10/chartex" xmlns:cx5="http://schemas.microsoft.com/office/drawing/2016/5/11/chartex" xmlns:cx6="http://schemas.microsoft.com/office/drawing/2016/5/12/chartex" xmlns:cx7="http://schemas.microsoft.com/office/drawing/2016/5/13/chartex" xmlns:cx8="http://schemas.microsoft.com/office/drawing/2016/5/14/chartex" xmlns:mc="http://schemas.openxmlformats.org/markup-compatibility/2006" xmlns:m="http://schemas.openxmlformats.org/officeDocument/2006/math" xmlns:aink="http://schemas.microsoft.com/office/drawing/2016/ink" xmlns:am3d="http://schemas.microsoft.com/office/drawing/2017/model3d" xmlns:oel="http://schemas.microsoft.com/office/2019/extlst" xmlns:r="http://schemas.openxmlformats.org/officeDocument/2006/relationships" xmlns:wp14="http://schemas.microsoft.com/office/word/2010/wordprocessingDrawing" xmlns:wp="http://schemas.openxmlformats.org/drawingml/2006/wordprocessingDrawing" xmlns:wpg="http://schemas.microsoft.com/office/word/2010/wordprocessingGroup" xmlns:wpi="http://schemas.microsoft.com/office/word/2010/wordprocessingInk" xmlns:wps="http://schemas.microsoft.com/office/word/2010/wordprocessingShape" xmlns:o="urn:schemas-microsoft-com:office:office" xmlns:v="urn:schemas-microsoft-com:vml" xmlns:w10="urn:schemas-microsoft-com:office:word" xmlns:w="http://schemas.openxmlformats.org/wordprocessingml/2006/main" xmlns:w14="http://schemas.microsoft.com/office/word/2010/wordml" xmlns:w15="http://schemas.microsoft.com/office/word/2012/wordml" xmlns:w16cex="http://schemas.microsoft.com/office/word/2018/wordml/cex" xmlns:w16cid="http://schemas.microsoft.com/office/word/2016/wordml/cid" xmlns:w16="http://schemas.microsoft.com/office/word/2018/wordml" xmlns:w16sdtdh="http://schemas.microsoft.com/office/word/2020/wordml/sdtdatahash" xmlns:w16sdtfl="http://schemas.microsoft.com/office/word/2024/wordml/sdtformatlock" xmlns:w16se="http://schemas.microsoft.com/office/word/2015/wordml/symex" xmlns:w16du="http://schemas.microsoft.com/office/word/2023/wordml/word16du" xmlns:wne="http://schemas.microsoft.com/office/word/2006/wordml" mc:Ignorable="w14 w15 w16se w16cid w16 w16cex w16sdtdh w16sdtfl w16du wp14">
   <w:p>
     <w:pPr>
       <w:pStyle w:val="Header"/>
@@ -8468,7 +8814,7 @@
 </file>
 
 <file path=word/header3.xml><?xml version="1.0" encoding="utf-8"?>
-<w:hdr xmlns:wpc="http://schemas.microsoft.com/office/word/2010/wordprocessingCanvas" xmlns:cx="http://schemas.microsoft.com/office/drawing/2014/chartex" xmlns:cx1="http://schemas.microsoft.com/office/drawing/2015/9/8/chartex" xmlns:cx2="http://schemas.microsoft.com/office/drawing/2015/10/21/chartex" xmlns:cx3="http://schemas.microsoft.com/office/drawing/2016/5/9/chartex" xmlns:cx4="http://schemas.microsoft.com/office/drawing/2016/5/10/chartex" xmlns:cx5="http://schemas.microsoft.com/office/drawing/2016/5/11/chartex" xmlns:cx6="http://schemas.microsoft.com/office/drawing/2016/5/12/chartex" xmlns:cx7="http://schemas.microsoft.com/office/drawing/2016/5/13/chartex" xmlns:cx8="http://schemas.microsoft.com/office/drawing/2016/5/14/chartex" xmlns:mc="http://schemas.openxmlformats.org/markup-compatibility/2006" xmlns:aink="http://schemas.microsoft.com/office/drawing/2016/ink" xmlns:am3d="http://schemas.microsoft.com/office/drawing/2017/model3d" xmlns:o="urn:schemas-microsoft-com:office:office" xmlns:oel="http://schemas.microsoft.com/office/2019/extlst" xmlns:r="http://schemas.openxmlformats.org/officeDocument/2006/relationships" xmlns:m="http://schemas.openxmlformats.org/officeDocument/2006/math" xmlns:v="urn:schemas-microsoft-com:vml" xmlns:wp14="http://schemas.microsoft.com/office/word/2010/wordprocessingDrawing" xmlns:wp="http://schemas.openxmlformats.org/drawingml/2006/wordprocessingDrawing" xmlns:w10="urn:schemas-microsoft-com:office:word" xmlns:w="http://schemas.openxmlformats.org/wordprocessingml/2006/main" xmlns:w14="http://schemas.microsoft.com/office/word/2010/wordml" xmlns:w15="http://schemas.microsoft.com/office/word/2012/wordml" xmlns:w16cex="http://schemas.microsoft.com/office/word/2018/wordml/cex" xmlns:w16cid="http://schemas.microsoft.com/office/word/2016/wordml/cid" xmlns:w16="http://schemas.microsoft.com/office/word/2018/wordml" xmlns:w16du="http://schemas.microsoft.com/office/word/2023/wordml/word16du" xmlns:w16sdtdh="http://schemas.microsoft.com/office/word/2020/wordml/sdtdatahash" xmlns:w16se="http://schemas.microsoft.com/office/word/2015/wordml/symex" xmlns:wpg="http://schemas.microsoft.com/office/word/2010/wordprocessingGroup" xmlns:wpi="http://schemas.microsoft.com/office/word/2010/wordprocessingInk" xmlns:wne="http://schemas.microsoft.com/office/word/2006/wordml" xmlns:wps="http://schemas.microsoft.com/office/word/2010/wordprocessingShape" mc:Ignorable="w14 w15 w16se w16cid w16 w16cex w16sdtdh w16du wp14">
+<w:hdr xmlns:wpc="http://schemas.microsoft.com/office/word/2010/wordprocessingCanvas" xmlns:cx="http://schemas.microsoft.com/office/drawing/2014/chartex" xmlns:cx1="http://schemas.microsoft.com/office/drawing/2015/9/8/chartex" xmlns:cx2="http://schemas.microsoft.com/office/drawing/2015/10/21/chartex" xmlns:cx3="http://schemas.microsoft.com/office/drawing/2016/5/9/chartex" xmlns:cx4="http://schemas.microsoft.com/office/drawing/2016/5/10/chartex" xmlns:cx5="http://schemas.microsoft.com/office/drawing/2016/5/11/chartex" xmlns:cx6="http://schemas.microsoft.com/office/drawing/2016/5/12/chartex" xmlns:cx7="http://schemas.microsoft.com/office/drawing/2016/5/13/chartex" xmlns:cx8="http://schemas.microsoft.com/office/drawing/2016/5/14/chartex" xmlns:mc="http://schemas.openxmlformats.org/markup-compatibility/2006" xmlns:m="http://schemas.openxmlformats.org/officeDocument/2006/math" xmlns:aink="http://schemas.microsoft.com/office/drawing/2016/ink" xmlns:am3d="http://schemas.microsoft.com/office/drawing/2017/model3d" xmlns:oel="http://schemas.microsoft.com/office/2019/extlst" xmlns:r="http://schemas.openxmlformats.org/officeDocument/2006/relationships" xmlns:wp14="http://schemas.microsoft.com/office/word/2010/wordprocessingDrawing" xmlns:wp="http://schemas.openxmlformats.org/drawingml/2006/wordprocessingDrawing" xmlns:wpg="http://schemas.microsoft.com/office/word/2010/wordprocessingGroup" xmlns:wpi="http://schemas.microsoft.com/office/word/2010/wordprocessingInk" xmlns:wps="http://schemas.microsoft.com/office/word/2010/wordprocessingShape" xmlns:o="urn:schemas-microsoft-com:office:office" xmlns:v="urn:schemas-microsoft-com:vml" xmlns:w10="urn:schemas-microsoft-com:office:word" xmlns:w="http://schemas.openxmlformats.org/wordprocessingml/2006/main" xmlns:w14="http://schemas.microsoft.com/office/word/2010/wordml" xmlns:w15="http://schemas.microsoft.com/office/word/2012/wordml" xmlns:w16cex="http://schemas.microsoft.com/office/word/2018/wordml/cex" xmlns:w16cid="http://schemas.microsoft.com/office/word/2016/wordml/cid" xmlns:w16="http://schemas.microsoft.com/office/word/2018/wordml" xmlns:w16sdtdh="http://schemas.microsoft.com/office/word/2020/wordml/sdtdatahash" xmlns:w16sdtfl="http://schemas.microsoft.com/office/word/2024/wordml/sdtformatlock" xmlns:w16se="http://schemas.microsoft.com/office/word/2015/wordml/symex" xmlns:w16du="http://schemas.microsoft.com/office/word/2023/wordml/word16du" xmlns:wne="http://schemas.microsoft.com/office/word/2006/wordml" mc:Ignorable="w14 w15 w16se w16cid w16 w16cex w16sdtdh w16sdtfl w16du wp14">
   <w:p>
     <w:pPr>
       <w:pStyle w:val="Header"/>
@@ -8478,7 +8824,7 @@
 </file>
 
 <file path=word/numbering.xml><?xml version="1.0" encoding="utf-8"?>
-<w:numbering xmlns:wpc="http://schemas.microsoft.com/office/word/2010/wordprocessingCanvas" xmlns:cx="http://schemas.microsoft.com/office/drawing/2014/chartex" xmlns:cx1="http://schemas.microsoft.com/office/drawing/2015/9/8/chartex" xmlns:cx2="http://schemas.microsoft.com/office/drawing/2015/10/21/chartex" xmlns:cx3="http://schemas.microsoft.com/office/drawing/2016/5/9/chartex" xmlns:cx4="http://schemas.microsoft.com/office/drawing/2016/5/10/chartex" xmlns:cx5="http://schemas.microsoft.com/office/drawing/2016/5/11/chartex" xmlns:cx6="http://schemas.microsoft.com/office/drawing/2016/5/12/chartex" xmlns:cx7="http://schemas.microsoft.com/office/drawing/2016/5/13/chartex" xmlns:cx8="http://schemas.microsoft.com/office/drawing/2016/5/14/chartex" xmlns:mc="http://schemas.openxmlformats.org/markup-compatibility/2006" xmlns:aink="http://schemas.microsoft.com/office/drawing/2016/ink" xmlns:am3d="http://schemas.microsoft.com/office/drawing/2017/model3d" xmlns:o="urn:schemas-microsoft-com:office:office" xmlns:oel="http://schemas.microsoft.com/office/2019/extlst" xmlns:r="http://schemas.openxmlformats.org/officeDocument/2006/relationships" xmlns:m="http://schemas.openxmlformats.org/officeDocument/2006/math" xmlns:v="urn:schemas-microsoft-com:vml" xmlns:wp14="http://schemas.microsoft.com/office/word/2010/wordprocessingDrawing" xmlns:wp="http://schemas.openxmlformats.org/drawingml/2006/wordprocessingDrawing" xmlns:w10="urn:schemas-microsoft-com:office:word" xmlns:w="http://schemas.openxmlformats.org/wordprocessingml/2006/main" xmlns:w14="http://schemas.microsoft.com/office/word/2010/wordml" xmlns:w15="http://schemas.microsoft.com/office/word/2012/wordml" xmlns:w16cex="http://schemas.microsoft.com/office/word/2018/wordml/cex" xmlns:w16cid="http://schemas.microsoft.com/office/word/2016/wordml/cid" xmlns:w16="http://schemas.microsoft.com/office/word/2018/wordml" xmlns:w16du="http://schemas.microsoft.com/office/word/2023/wordml/word16du" xmlns:w16sdtdh="http://schemas.microsoft.com/office/word/2020/wordml/sdtdatahash" xmlns:w16se="http://schemas.microsoft.com/office/word/2015/wordml/symex" xmlns:wpg="http://schemas.microsoft.com/office/word/2010/wordprocessingGroup" xmlns:wpi="http://schemas.microsoft.com/office/word/2010/wordprocessingInk" xmlns:wne="http://schemas.microsoft.com/office/word/2006/wordml" xmlns:wps="http://schemas.microsoft.com/office/word/2010/wordprocessingShape" mc:Ignorable="w14 w15 w16se w16cid w16 w16cex w16sdtdh w16du wp14">
+<w:numbering xmlns:wpc="http://schemas.microsoft.com/office/word/2010/wordprocessingCanvas" xmlns:cx="http://schemas.microsoft.com/office/drawing/2014/chartex" xmlns:cx1="http://schemas.microsoft.com/office/drawing/2015/9/8/chartex" xmlns:cx2="http://schemas.microsoft.com/office/drawing/2015/10/21/chartex" xmlns:cx3="http://schemas.microsoft.com/office/drawing/2016/5/9/chartex" xmlns:cx4="http://schemas.microsoft.com/office/drawing/2016/5/10/chartex" xmlns:cx5="http://schemas.microsoft.com/office/drawing/2016/5/11/chartex" xmlns:cx6="http://schemas.microsoft.com/office/drawing/2016/5/12/chartex" xmlns:cx7="http://schemas.microsoft.com/office/drawing/2016/5/13/chartex" xmlns:cx8="http://schemas.microsoft.com/office/drawing/2016/5/14/chartex" xmlns:mc="http://schemas.openxmlformats.org/markup-compatibility/2006" xmlns:m="http://schemas.openxmlformats.org/officeDocument/2006/math" xmlns:aink="http://schemas.microsoft.com/office/drawing/2016/ink" xmlns:am3d="http://schemas.microsoft.com/office/drawing/2017/model3d" xmlns:oel="http://schemas.microsoft.com/office/2019/extlst" xmlns:r="http://schemas.openxmlformats.org/officeDocument/2006/relationships" xmlns:wp14="http://schemas.microsoft.com/office/word/2010/wordprocessingDrawing" xmlns:wp="http://schemas.openxmlformats.org/drawingml/2006/wordprocessingDrawing" xmlns:wpg="http://schemas.microsoft.com/office/word/2010/wordprocessingGroup" xmlns:wpi="http://schemas.microsoft.com/office/word/2010/wordprocessingInk" xmlns:wps="http://schemas.microsoft.com/office/word/2010/wordprocessingShape" xmlns:o="urn:schemas-microsoft-com:office:office" xmlns:v="urn:schemas-microsoft-com:vml" xmlns:w10="urn:schemas-microsoft-com:office:word" xmlns:w="http://schemas.openxmlformats.org/wordprocessingml/2006/main" xmlns:w14="http://schemas.microsoft.com/office/word/2010/wordml" xmlns:w15="http://schemas.microsoft.com/office/word/2012/wordml" xmlns:w16cex="http://schemas.microsoft.com/office/word/2018/wordml/cex" xmlns:w16cid="http://schemas.microsoft.com/office/word/2016/wordml/cid" xmlns:w16="http://schemas.microsoft.com/office/word/2018/wordml" xmlns:w16sdtdh="http://schemas.microsoft.com/office/word/2020/wordml/sdtdatahash" xmlns:w16sdtfl="http://schemas.microsoft.com/office/word/2024/wordml/sdtformatlock" xmlns:w16se="http://schemas.microsoft.com/office/word/2015/wordml/symex" xmlns:w16du="http://schemas.microsoft.com/office/word/2023/wordml/word16du" xmlns:wne="http://schemas.microsoft.com/office/word/2006/wordml" mc:Ignorable="w14 w15 w16se w16cid w16 w16cex w16sdtdh w16sdtfl w16du wp14">
   <w:abstractNum w:abstractNumId="0" w15:restartNumberingAfterBreak="0">
     <w:nsid w:val="46352678"/>
     <w:multiLevelType w:val="multilevel"/>
@@ -8740,7 +9086,7 @@
 </file>
 
 <file path=word/styles.xml><?xml version="1.0" encoding="utf-8"?>
-<w:styles xmlns:mc="http://schemas.openxmlformats.org/markup-compatibility/2006" xmlns:r="http://schemas.openxmlformats.org/officeDocument/2006/relationships" xmlns:w="http://schemas.openxmlformats.org/wordprocessingml/2006/main" xmlns:w14="http://schemas.microsoft.com/office/word/2010/wordml" xmlns:w15="http://schemas.microsoft.com/office/word/2012/wordml" xmlns:w16cex="http://schemas.microsoft.com/office/word/2018/wordml/cex" xmlns:w16cid="http://schemas.microsoft.com/office/word/2016/wordml/cid" xmlns:w16="http://schemas.microsoft.com/office/word/2018/wordml" xmlns:w16du="http://schemas.microsoft.com/office/word/2023/wordml/word16du" xmlns:w16sdtdh="http://schemas.microsoft.com/office/word/2020/wordml/sdtdatahash" xmlns:w16se="http://schemas.microsoft.com/office/word/2015/wordml/symex" mc:Ignorable="w14 w15 w16se w16cid w16 w16cex w16sdtdh w16du">
+<w:styles xmlns:mc="http://schemas.openxmlformats.org/markup-compatibility/2006" xmlns:r="http://schemas.openxmlformats.org/officeDocument/2006/relationships" xmlns:w="http://schemas.openxmlformats.org/wordprocessingml/2006/main" xmlns:w14="http://schemas.microsoft.com/office/word/2010/wordml" xmlns:w15="http://schemas.microsoft.com/office/word/2012/wordml" xmlns:w16cex="http://schemas.microsoft.com/office/word/2018/wordml/cex" xmlns:w16cid="http://schemas.microsoft.com/office/word/2016/wordml/cid" xmlns:w16="http://schemas.microsoft.com/office/word/2018/wordml" xmlns:w16sdtdh="http://schemas.microsoft.com/office/word/2020/wordml/sdtdatahash" xmlns:w16sdtfl="http://schemas.microsoft.com/office/word/2024/wordml/sdtformatlock" xmlns:w16se="http://schemas.microsoft.com/office/word/2015/wordml/symex" xmlns:w16du="http://schemas.microsoft.com/office/word/2023/wordml/word16du" mc:Ignorable="w14 w15 w16se w16cid w16 w16cex w16sdtdh w16sdtfl w16du">
   <w:docDefaults>
     <w:rPrDefault>
       <w:rPr>

</xml_diff>

<commit_message>
Fix missing field labels and some clean up
</commit_message>
<xml_diff>
--- a/docassemble/CriminalDocketingStatement/data/templates/criminal_docketing_statement.docx
+++ b/docassemble/CriminalDocketingStatement/data/templates/criminal_docketing_statement.docx
@@ -4224,7 +4224,15 @@
           <w:sz w:val="20"/>
           <w:szCs w:val="20"/>
         </w:rPr>
-        <w:t>{{ "</w:t>
+        <w:t xml:space="preserve">{{ </w:t>
+      </w:r>
+      <w:proofErr w:type="spellStart"/>
+      <w:r>
+        <w:rPr>
+          <w:sz w:val="20"/>
+          <w:szCs w:val="20"/>
+        </w:rPr>
+        <w:t>nature</w:t>
       </w:r>
       <w:proofErr w:type="gramEnd"/>
       <w:r>
@@ -4232,7 +4240,7 @@
           <w:sz w:val="20"/>
           <w:szCs w:val="20"/>
         </w:rPr>
-        <w:t xml:space="preserve">, </w:t>
+        <w:t>_of_</w:t>
       </w:r>
       <w:proofErr w:type="gramStart"/>
       <w:r>
@@ -4240,91 +4248,21 @@
           <w:sz w:val="20"/>
           <w:szCs w:val="20"/>
         </w:rPr>
-        <w:t>".join</w:t>
+        <w:t>appeal</w:t>
+      </w:r>
+      <w:proofErr w:type="spellEnd"/>
+      <w:r>
+        <w:rPr>
+          <w:sz w:val="20"/>
+          <w:szCs w:val="20"/>
+        </w:rPr>
+        <w:t xml:space="preserve"> }</w:t>
       </w:r>
       <w:proofErr w:type="gramEnd"/>
       <w:r>
         <w:rPr>
           <w:sz w:val="20"/>
           <w:szCs w:val="20"/>
-        </w:rPr>
-        <w:t>(</w:t>
-      </w:r>
-      <w:proofErr w:type="spellStart"/>
-      <w:r>
-        <w:rPr>
-          <w:sz w:val="20"/>
-          <w:szCs w:val="20"/>
-        </w:rPr>
-        <w:t>nature_of_</w:t>
-      </w:r>
-      <w:proofErr w:type="gramStart"/>
-      <w:r>
-        <w:rPr>
-          <w:sz w:val="20"/>
-          <w:szCs w:val="20"/>
-        </w:rPr>
-        <w:t>appeal.true</w:t>
-      </w:r>
-      <w:proofErr w:type="gramEnd"/>
-      <w:r>
-        <w:rPr>
-          <w:sz w:val="20"/>
-          <w:szCs w:val="20"/>
-        </w:rPr>
-        <w:t>_</w:t>
-      </w:r>
-      <w:proofErr w:type="gramStart"/>
-      <w:r>
-        <w:rPr>
-          <w:sz w:val="20"/>
-          <w:szCs w:val="20"/>
-        </w:rPr>
-        <w:t>values</w:t>
-      </w:r>
-      <w:proofErr w:type="spellEnd"/>
-      <w:r>
-        <w:rPr>
-          <w:sz w:val="20"/>
-          <w:szCs w:val="20"/>
-        </w:rPr>
-        <w:t>(</w:t>
-      </w:r>
-      <w:proofErr w:type="gramEnd"/>
-      <w:r>
-        <w:rPr>
-          <w:sz w:val="20"/>
-          <w:szCs w:val="20"/>
-        </w:rPr>
-        <w:t>)</w:t>
-      </w:r>
-      <w:proofErr w:type="gramStart"/>
-      <w:r>
-        <w:rPr>
-          <w:sz w:val="20"/>
-          <w:szCs w:val="20"/>
-        </w:rPr>
-        <w:t>)</w:t>
-      </w:r>
-      <w:r>
-        <w:rPr>
-          <w:spacing w:val="-2"/>
-          <w:sz w:val="20"/>
-        </w:rPr>
-        <w:t xml:space="preserve"> </w:t>
-      </w:r>
-      <w:r>
-        <w:rPr>
-          <w:spacing w:val="-2"/>
-          <w:sz w:val="20"/>
-        </w:rPr>
-        <w:t>}</w:t>
-      </w:r>
-      <w:proofErr w:type="gramEnd"/>
-      <w:r>
-        <w:rPr>
-          <w:spacing w:val="-2"/>
-          <w:sz w:val="20"/>
         </w:rPr>
         <w:t>}</w:t>
       </w:r>
@@ -5227,13 +5165,146 @@
           <w:spacing w:val="-2"/>
           <w:sz w:val="20"/>
         </w:rPr>
-        <w:t xml:space="preserve">address:  </w:t>
-      </w:r>
-      <w:r>
-        <w:rPr>
-          <w:sz w:val="20"/>
-        </w:rPr>
-        <w:t>{% if defendant_incarcerated %} {{ institution_name }}, {{ defendant_address.on_one_line() }} {% else %} {{ defendant_address.on_one_line() }} {% endif %}</w:t>
+        <w:t>address</w:t>
+      </w:r>
+      <w:proofErr w:type="gramStart"/>
+      <w:r>
+        <w:rPr>
+          <w:spacing w:val="-2"/>
+          <w:sz w:val="20"/>
+        </w:rPr>
+        <w:t xml:space="preserve">:  </w:t>
+      </w:r>
+      <w:r>
+        <w:rPr>
+          <w:sz w:val="20"/>
+        </w:rPr>
+        <w:t>{</w:t>
+      </w:r>
+      <w:proofErr w:type="gramEnd"/>
+      <w:r>
+        <w:rPr>
+          <w:sz w:val="20"/>
+        </w:rPr>
+        <w:t xml:space="preserve">% if </w:t>
+      </w:r>
+      <w:proofErr w:type="spellStart"/>
+      <w:r>
+        <w:rPr>
+          <w:sz w:val="20"/>
+        </w:rPr>
+        <w:t>defendant_incarcerated</w:t>
+      </w:r>
+      <w:proofErr w:type="spellEnd"/>
+      <w:r>
+        <w:rPr>
+          <w:sz w:val="20"/>
+        </w:rPr>
+        <w:t xml:space="preserve"> %} {{</w:t>
+      </w:r>
+      <w:proofErr w:type="spellStart"/>
+      <w:r>
+        <w:rPr>
+          <w:sz w:val="20"/>
+        </w:rPr>
+        <w:t>institution_name</w:t>
+      </w:r>
+      <w:proofErr w:type="spellEnd"/>
+      <w:r>
+        <w:rPr>
+          <w:sz w:val="20"/>
+        </w:rPr>
+        <w:t>}}, {{</w:t>
+      </w:r>
+      <w:proofErr w:type="spellStart"/>
+      <w:r>
+        <w:rPr>
+          <w:sz w:val="20"/>
+        </w:rPr>
+        <w:t>defendant_</w:t>
+      </w:r>
+      <w:proofErr w:type="gramStart"/>
+      <w:r>
+        <w:rPr>
+          <w:sz w:val="20"/>
+        </w:rPr>
+        <w:t>address.on</w:t>
+      </w:r>
+      <w:proofErr w:type="gramEnd"/>
+      <w:r>
+        <w:rPr>
+          <w:sz w:val="20"/>
+        </w:rPr>
+        <w:t>_one_</w:t>
+      </w:r>
+      <w:proofErr w:type="gramStart"/>
+      <w:r>
+        <w:rPr>
+          <w:sz w:val="20"/>
+        </w:rPr>
+        <w:t>line</w:t>
+      </w:r>
+      <w:proofErr w:type="spellEnd"/>
+      <w:r>
+        <w:rPr>
+          <w:sz w:val="20"/>
+        </w:rPr>
+        <w:t>(</w:t>
+      </w:r>
+      <w:proofErr w:type="gramEnd"/>
+      <w:r>
+        <w:rPr>
+          <w:sz w:val="20"/>
+        </w:rPr>
+        <w:t>)}} {% else %} {{</w:t>
+      </w:r>
+      <w:proofErr w:type="spellStart"/>
+      <w:r>
+        <w:rPr>
+          <w:sz w:val="20"/>
+        </w:rPr>
+        <w:t>defendant_</w:t>
+      </w:r>
+      <w:proofErr w:type="gramStart"/>
+      <w:r>
+        <w:rPr>
+          <w:sz w:val="20"/>
+        </w:rPr>
+        <w:t>address.on</w:t>
+      </w:r>
+      <w:proofErr w:type="gramEnd"/>
+      <w:r>
+        <w:rPr>
+          <w:sz w:val="20"/>
+        </w:rPr>
+        <w:t>_one_</w:t>
+      </w:r>
+      <w:proofErr w:type="gramStart"/>
+      <w:r>
+        <w:rPr>
+          <w:sz w:val="20"/>
+        </w:rPr>
+        <w:t>line</w:t>
+      </w:r>
+      <w:proofErr w:type="spellEnd"/>
+      <w:r>
+        <w:rPr>
+          <w:sz w:val="20"/>
+        </w:rPr>
+        <w:t>(</w:t>
+      </w:r>
+      <w:proofErr w:type="gramEnd"/>
+      <w:r>
+        <w:rPr>
+          <w:sz w:val="20"/>
+        </w:rPr>
+        <w:t>)}} {% endif %}</w:t>
+      </w:r>
+      <w:r>
+        <w:rPr>
+          <w:sz w:val="20"/>
+        </w:rPr>
+        <w:t xml:space="preserve"> </w:t>
       </w:r>
       <w:r>
         <w:rPr>

</xml_diff>